<commit_message>
Add Table 6 generation (API, template, UI)
Add end-to-end support for generating Table 6 DOCX. Backend: new /generate-table6 route in modules/kew/kew_api.py and new functions in modules/report/gen_word.py (generate_table6_docx, generate_table6_from_zip) with helpers for formatting and auto-comments; reads optional Excel from ZIP (pandas/openpyxl) and returns warnings via header. Template: add static/word-template/table6.docx. Frontend: update templates/components/workspaces/kew.html to add UI/button/spinner for "Tạo Bảng 6.3", new kewTable6ProcessZip JS handler, minor UI/text/layout tweaks and adjusted output filename behavior. Includes error handling and downloads generated .docx.
</commit_message>
<xml_diff>
--- a/static/word-template/table6.docx
+++ b/static/word-template/table6.docx
@@ -545,7 +545,10 @@
             </w:r>
             <w:proofErr w:type="spellEnd"/>
             <w:r>
-              <w:t xml:space="preserve"> %}{{ item.tt }}</w:t>
+              <w:t xml:space="preserve"> %}</w:t>
+            </w:r>
+            <w:r>
+              <w:t>{{ item.tt }}</w:t>
             </w:r>
           </w:p>
         </w:tc>
@@ -749,11 +752,22 @@
               </w:rPr>
             </w:pPr>
             <w:r>
-              <w:t xml:space="preserve">{{ item.nhan_xet }}{% tr </w:t>
+              <w:t xml:space="preserve">{{ </w:t>
             </w:r>
             <w:proofErr w:type="spellStart"/>
             <w:r>
-              <w:t>endfor</w:t>
+              <w:t>item.nhan_xet</w:t>
+            </w:r>
+            <w:proofErr w:type="spellEnd"/>
+            <w:r>
+              <w:t xml:space="preserve"> }}</w:t>
+            </w:r>
+            <w:r>
+              <w:t xml:space="preserve">{% </w:t>
+            </w:r>
+            <w:proofErr w:type="spellStart"/>
+            <w:r>
+              <w:t>endtr</w:t>
             </w:r>
             <w:proofErr w:type="spellEnd"/>
             <w:r>

</xml_diff>